<commit_message>
Update adrenal segmentation pipeline
</commit_message>
<xml_diff>
--- a/docs/methodology.docx
+++ b/docs/methodology.docx
@@ -14,7 +14,7 @@
           <w:sz w:val="32"/>
           <w:szCs w:val="32"/>
         </w:rPr>
-        <w:t xml:space="preserve">A Sequence-Aware Spiking Slice Gate for Sensitivity-Controlled Adrenal Gland and Tumour Segmentation</w:t>
+        <w:t xml:space="preserve">A Sequence-Aware Spiking Slice Gate for Sensitivity-Controlled Left and Right Adrenal Gland Segmentation</w:t>
       </w:r>
     </w:p>
     <w:p>
@@ -42,7 +42,7 @@
           <w:sz w:val="22"/>
           <w:szCs w:val="22"/>
         </w:rPr>
-        <w:t xml:space="preserve">Draft methodology document — v1.0</w:t>
+        <w:t xml:space="preserve">Draft methodology document — v1.1 (revised: gland-only scope, tumour segmentation removed)</w:t>
       </w:r>
     </w:p>
     <w:p>
@@ -92,7 +92,7 @@
         <w:jc w:val="both"/>
       </w:pPr>
       <w:r>
-        <w:t xml:space="preserve">Two-stage “classify-then-segment” cascades for small, anatomically variable organs are an established pattern in CT segmentation, and a spiking neural network (SNN) substituted for a conventional CNN classifier is not, by itself, a sufficient contribution for a strong journal. This document proposes a more defensible framing: a sensitivity-controlled slice-selection gate whose SNN component is used for a property conventional classifiers do not have — modelling a sequence of anatomically ordered CT slices as discrete spiking time steps, rather than repeating one static image across time. The gate feeds an uncertainty-aware adaptive slice buffer, which in turn restricts a 2.5D U-Net segmenter (extending a previously published 2D U-Net + test-time augmentation + connected-component pipeline) to only the slice range plausibly containing adrenal or tumour tissue. The central empirical claim — that the spiking, sequence-aware gate earns its complexity — is only credible if it is compared against a matched-capacity CNN-LSTM gate on sensitivity-first metrics, not merely against a plain CNN on simulated energy proxies; that comparison is built into the experimental design as a mandatory ablation arm, not an optional one. This document specifies the full method, the accompanying open-source implementation (tested against synthetic data), the ablation and statistical validation plan, and the positioning against comparable published work. Reported results are left as placeholders pending training on a patient cohort.</w:t>
+        <w:t xml:space="preserve">Two-stage “classify-then-segment” cascades for small, anatomically variable organs are an established pattern in CT segmentation, and a spiking neural network (SNN) substituted for a conventional CNN classifier is not, by itself, a sufficient contribution for a strong journal. This document proposes a more defensible framing: a sensitivity-controlled slice-selection gate whose SNN component is used for a property conventional classifiers do not have — modelling a sequence of anatomically ordered CT slices as discrete spiking time steps, rather than repeating one static image across time. The gate feeds an uncertainty-aware adaptive slice buffer, which in turn restricts a 2.5D U-Net segmenter (extending a previously published 2D U-Net + test-time augmentation + connected-component pipeline) to only the slice range plausibly containing adrenal gland tissue. The central empirical claim — that the spiking, sequence-aware gate earns its complexity — is only credible if it is compared against a matched-capacity CNN-LSTM gate on sensitivity-first metrics, not merely against a plain CNN on simulated energy proxies; that comparison is built into the experimental design as a mandatory ablation arm, not an optional one. This document specifies the full method, the accompanying open-source implementation (tested against synthetic data), the ablation and statistical validation plan, and the positioning against comparable published work. Reported results are left as placeholders pending training on a patient cohort.</w:t>
       </w:r>
     </w:p>
     <w:p>
@@ -110,7 +110,7 @@
         <w:jc w:val="both"/>
       </w:pPr>
       <w:r>
-        <w:t xml:space="preserve">Adrenal gland and adrenocortical tumour segmentation from abdominal CT is difficult because the gland is small, its shape varies substantially between patients, and it sits adjacent to organs — kidney, liver, spleen, pancreas — with similar CT intensity characteristics. A prior pipeline (2D U-Net with a choice of VGG16, ResNet34, or InceptionV3 encoder backbones, combined with test-time augmentation and connected-component post-processing to discard small disconnected false-positive fragments) was published by the authors and evaluated on the AMOS dataset, with the InceptionV3 backbone achieving a 38% improvement in Dice similarity coefficient for the left adrenal gland and 11% for the right, alongside a substantial reduction in false-positive detections (Fayemiwo et al., 2025).</w:t>
+        <w:t xml:space="preserve">Left and right adrenal gland segmentation from abdominal CT is difficult because the gland is small, its shape varies substantially between patients, and it sits adjacent to organs — kidney, liver, spleen, pancreas — with similar CT intensity characteristics. A prior pipeline (2D U-Net with a choice of VGG16, ResNet34, or InceptionV3 encoder backbones, combined with test-time augmentation and connected-component post-processing to discard small disconnected false-positive fragments) was published by the authors and evaluated on the AMOS dataset, with the InceptionV3 backbone achieving a 38% improvement in Dice similarity coefficient for the left adrenal gland and 11% for the right, alongside a substantial reduction in false-positive detections (Fayemiwo et al., 2025).</w:t>
       </w:r>
     </w:p>
     <w:p>
@@ -601,7 +601,7 @@
                 <w:sz w:val="20"/>
                 <w:szCs w:val="20"/>
               </w:rPr>
-              <w:t xml:space="preserve">left_present / right_present / tumour_present probabilities per centre slice</w:t>
+              <w:t xml:space="preserve">left_present / right_present probabilities per centre slice</w:t>
             </w:r>
           </w:p>
         </w:tc>
@@ -805,7 +805,7 @@
                 <w:sz w:val="20"/>
                 <w:szCs w:val="20"/>
               </w:rPr>
-              <w:t xml:space="preserve">Binary gland/tumour mask per included slice</w:t>
+              <w:t xml:space="preserve">Binary left/right gland mask per included slice</w:t>
             </w:r>
           </w:p>
         </w:tc>
@@ -986,7 +986,7 @@
         <w:jc w:val="both"/>
       </w:pPr>
       <w:r>
-        <w:t xml:space="preserve">The gate receives a window of k consecutive axial slices (k ∈ {3, …, 7}, default 5) centred on a candidate slice, in true craniocaudal order. Each slice is presented to a spiking residual convolutional network as one discrete time step t = 1, …, k. At every time step, a shared convolutional stem and three residual blocks process the current slice; each block's leaky-integrate-and-fire (LIF) layer carries its membrane potential forward into the next time step, so evidence from slice t − 1 directly influences how slice t's convolutional response is interpreted. A final LIF read-out layer accumulates a spike-rate feature across all k time steps, which is passed through a shared dense layer and three linear heads producing left_present, right_present, and tumour_present logits.</w:t>
+        <w:t xml:space="preserve">The gate receives a window of k consecutive axial slices (k ∈ {3, …, 7}, default 5) centred on a candidate slice, in true craniocaudal order. Each slice is presented to a spiking residual convolutional network as one discrete time step t = 1, …, k. At every time step, a shared convolutional stem and three residual blocks process the current slice; each block's leaky-integrate-and-fire (LIF) layer carries its membrane potential forward into the next time step, so evidence from slice t − 1 directly influences how slice t's convolutional response is interpreted. A final LIF read-out layer accumulates a spike-rate feature across all k time steps, which is passed through a shared dense layer and two linear heads producing left_present and right_present logits.</w:t>
       </w:r>
     </w:p>
     <w:p>
@@ -1004,7 +1004,7 @@
         <w:jc w:val="both"/>
       </w:pPr>
       <w:r>
-        <w:t xml:space="preserve">Training uses surrogate-gradient backpropagation (a smoothed sigmoid surrogate for the spike non-linearity, as implemented in snnTorch), a multi-head focal binary cross-entropy loss with per-head class weighting (tumour_present is typically far rarer than left/right_present and is weighted accordingly), and AdamW. Per the design review that motivated this project, the operating threshold is not the default 0.5: it is selected on the validation set as the highest threshold that still achieves sensitivity ≥ 0.98 (configurable), because a missed positive slice permanently removes true tissue from everything downstream, while a false positive only costs one wasted segmentation attempt. Sensitivity, specificity, NPV, F2, PR-AUC, and calibration (Brier score) are reported at that operating point rather than accuracy. Implemented in src/models/snn_gate.py and src/models/losses.py; threshold selection in src/evaluation/metrics.py.</w:t>
+        <w:t xml:space="preserve">Training uses surrogate-gradient backpropagation (a smoothed sigmoid surrogate for the spike non-linearity, as implemented in snnTorch), a multi-head focal binary cross-entropy loss with optional per-head class weighting (useful if positive slices for one side are rarer than the other in a given cohort), and AdamW. Per the design review that motivated this project, the operating threshold is not the default 0.5: it is selected on the validation set as the highest threshold that still achieves sensitivity ≥ 0.98 (configurable), because a missed positive slice permanently removes true tissue from everything downstream, while a false positive only costs one wasted segmentation attempt. Sensitivity, specificity, NPV, F2, PR-AUC, and calibration (Brier score) are reported at that operating point rather than accuracy. Implemented in src/models/snn_gate.py and src/models/losses.py; threshold selection in src/evaluation/metrics.py.</w:t>
       </w:r>
     </w:p>
     <w:p>

</xml_diff>